<commit_message>
Pivot pozycjonowania: Social Media Content Creator (AI-powered)
CV PL/EN + strona: nowy hero i kafel content/social, stack z CapCut Pro,
doswiadczenie Studio AI - Metoda Sufy, akcent aktorski (Gliniarze).
Zaakceptowane przez Macieja 11.07.2026.

Co-Authored-By: Claude Fable 5 <noreply@anthropic.com>
</commit_message>
<xml_diff>
--- a/public/cv/Maciej_Sufa_CV.docx
+++ b/public/cv/Maciej_Sufa_CV.docx
@@ -96,7 +96,7 @@
                 <w:sz w:val="18"/>
                 <w:szCs w:val="18"/>
               </w:rPr>
-              <w:t xml:space="preserve">Specjalista ds. automatyzacji procesów z AI</w:t>
+              <w:t xml:space="preserve">Social Media Content Creator (AI-powered)</w:t>
             </w:r>
           </w:p>
           <w:p>
@@ -235,6 +235,99 @@
                 <w:sz w:val="18"/>
                 <w:szCs w:val="18"/>
               </w:rPr>
+              <w:t xml:space="preserve">Content i social media</w:t>
+            </w:r>
+          </w:p>
+          <w:p>
+            <w:pPr>
+              <w:spacing w:after="20"/>
+            </w:pPr>
+            <w:r>
+              <w:rPr>
+                <w:color w:val="B8B5AD"/>
+                <w:sz w:val="17"/>
+                <w:szCs w:val="17"/>
+              </w:rPr>
+              <w:t xml:space="preserve">· CapCut Pro · DaVinci Resolve · ffmpeg</w:t>
+            </w:r>
+          </w:p>
+          <w:p>
+            <w:pPr>
+              <w:spacing w:after="20"/>
+            </w:pPr>
+            <w:r>
+              <w:rPr>
+                <w:color w:val="B8B5AD"/>
+                <w:sz w:val="17"/>
+                <w:szCs w:val="17"/>
+              </w:rPr>
+              <w:t xml:space="preserve">· Canva · GPT-Image · Midjourney</w:t>
+            </w:r>
+          </w:p>
+          <w:p>
+            <w:pPr>
+              <w:spacing w:after="20"/>
+            </w:pPr>
+            <w:r>
+              <w:rPr>
+                <w:color w:val="B8B5AD"/>
+                <w:sz w:val="17"/>
+                <w:szCs w:val="17"/>
+              </w:rPr>
+              <w:t xml:space="preserve">· Meta Business Suite</w:t>
+            </w:r>
+          </w:p>
+          <w:p>
+            <w:pPr>
+              <w:spacing w:after="20"/>
+            </w:pPr>
+            <w:r>
+              <w:rPr>
+                <w:color w:val="B8B5AD"/>
+                <w:sz w:val="17"/>
+                <w:szCs w:val="17"/>
+              </w:rPr>
+              <w:t xml:space="preserve">· Scenariusze · storyboard · redakcja PL</w:t>
+            </w:r>
+          </w:p>
+          <w:p>
+            <w:pPr>
+              <w:spacing w:after="20"/>
+            </w:pPr>
+            <w:r>
+              <w:rPr>
+                <w:color w:val="B8B5AD"/>
+                <w:sz w:val="17"/>
+                <w:szCs w:val="17"/>
+              </w:rPr>
+              <w:t xml:space="preserve">· Kalendarz treści · trendy · analityka</w:t>
+            </w:r>
+          </w:p>
+          <w:p>
+            <w:pPr>
+              <w:spacing w:after="20"/>
+            </w:pPr>
+            <w:r>
+              <w:rPr>
+                <w:color w:val="B8B5AD"/>
+                <w:sz w:val="17"/>
+                <w:szCs w:val="17"/>
+              </w:rPr>
+              <w:t xml:space="preserve">· Występowanie przed kamerą</w:t>
+            </w:r>
+          </w:p>
+          <w:p>
+            <w:pPr>
+              <w:spacing w:after="40" w:before="80"/>
+            </w:pPr>
+            <w:r>
+              <w:rPr>
+                <w:b/>
+                <w:bCs/>
+                <w:color w:val="E8E2D4"/>
+                <w:sz w:val="18"/>
+                <w:szCs w:val="18"/>
+              </w:rPr>
               <w:t xml:space="preserve">AI i automatyzacja</w:t>
             </w:r>
           </w:p>
@@ -287,7 +380,7 @@
                 <w:sz w:val="17"/>
                 <w:szCs w:val="17"/>
               </w:rPr>
-              <w:t xml:space="preserve">· Audyt AI</w:t>
+              <w:t xml:space="preserve">· Pipeline wideo end-to-end</w:t>
             </w:r>
           </w:p>
           <w:p>
@@ -315,7 +408,7 @@
                 <w:sz w:val="18"/>
                 <w:szCs w:val="18"/>
               </w:rPr>
-              <w:t xml:space="preserve">Development</w:t>
+              <w:t xml:space="preserve">Development · miękkie</w:t>
             </w:r>
           </w:p>
           <w:p>
@@ -341,20 +434,7 @@
                 <w:sz w:val="17"/>
                 <w:szCs w:val="17"/>
               </w:rPr>
-              <w:t xml:space="preserve">· Python · Tailwind</w:t>
-            </w:r>
-          </w:p>
-          <w:p>
-            <w:pPr>
-              <w:spacing w:after="20"/>
-            </w:pPr>
-            <w:r>
-              <w:rPr>
-                <w:color w:val="B8B5AD"/>
-                <w:sz w:val="17"/>
-                <w:szCs w:val="17"/>
-              </w:rPr>
-              <w:t xml:space="preserve">· No-code + AI</w:t>
+              <w:t xml:space="preserve">· Python · No-code + AI</w:t>
             </w:r>
           </w:p>
           <w:p>
@@ -372,69 +452,15 @@
           </w:p>
           <w:p>
             <w:pPr>
-              <w:spacing w:after="40" w:before="80"/>
-            </w:pPr>
-            <w:r>
-              <w:rPr>
-                <w:b/>
-                <w:bCs/>
-                <w:color w:val="E8E2D4"/>
-                <w:sz w:val="18"/>
-                <w:szCs w:val="18"/>
-              </w:rPr>
-              <w:t xml:space="preserve">Produkcja · miękkie</w:t>
-            </w:r>
-          </w:p>
-          <w:p>
-            <w:pPr>
-              <w:spacing w:after="20"/>
-            </w:pPr>
-            <w:r>
-              <w:rPr>
-                <w:color w:val="B8B5AD"/>
-                <w:sz w:val="17"/>
-                <w:szCs w:val="17"/>
-              </w:rPr>
-              <w:t xml:space="preserve">· Social media automation</w:t>
-            </w:r>
-          </w:p>
-          <w:p>
-            <w:pPr>
-              <w:spacing w:after="20"/>
-            </w:pPr>
-            <w:r>
-              <w:rPr>
-                <w:color w:val="B8B5AD"/>
-                <w:sz w:val="17"/>
-                <w:szCs w:val="17"/>
-              </w:rPr>
-              <w:t xml:space="preserve">· Pipeline wideo</w:t>
-            </w:r>
-          </w:p>
-          <w:p>
-            <w:pPr>
-              <w:spacing w:after="20"/>
-            </w:pPr>
-            <w:r>
-              <w:rPr>
-                <w:color w:val="B8B5AD"/>
-                <w:sz w:val="17"/>
-                <w:szCs w:val="17"/>
-              </w:rPr>
-              <w:t xml:space="preserve">· Komunikacja z klientem</w:t>
-            </w:r>
-          </w:p>
-          <w:p>
-            <w:pPr>
-              <w:spacing w:after="20"/>
-            </w:pPr>
-            <w:r>
-              <w:rPr>
-                <w:color w:val="B8B5AD"/>
-                <w:sz w:val="17"/>
-                <w:szCs w:val="17"/>
-              </w:rPr>
-              <w:t xml:space="preserve">· Wdrożenia · szkolenia</w:t>
+              <w:spacing w:after="20"/>
+            </w:pPr>
+            <w:r>
+              <w:rPr>
+                <w:color w:val="B8B5AD"/>
+                <w:sz w:val="17"/>
+                <w:szCs w:val="17"/>
+              </w:rPr>
+              <w:t xml:space="preserve">· Komunikacja z klientem · szkolenia</w:t>
             </w:r>
           </w:p>
           <w:p>
@@ -510,7 +536,7 @@
                 <w:sz w:val="20"/>
                 <w:szCs w:val="20"/>
               </w:rPr>
-              <w:t xml:space="preserve">Audytuję i automatyzuję procesy w firmach — aplikacje, integracje i rozwiązania AI zdejmujące powtarzalną robotę. Projektuję systemy z agentami AI, automatyzacje (n8n, Python, MCP) i pipeline'y social media. Audyt → prototyp → wdrożenie. Tło biznesowe: 3 lata obsługi klienta premium (salon Domoteka) i doświadczenie sceniczne (teatr, film, warsztaty) pomagają tłumaczyć technologię na język biznesu. Otwarty na etat lub B2B — posiadam działalność gospodarczą. Zdalnie · PL/EU.</w:t>
+              <w:t xml:space="preserve">Tworzę content na social media od pomysłu po publikację: scenariusze i redakcja tekstów, wideo (CapCut Pro, DaVinci Resolve, ffmpeg), grafiki i miniatury (Canva, GPT-Image), kalendarz treści sprzężony z trendami i analityką. Prowadzę własne kanały (YT/IG/FB) na autorskim, zautomatyzowanym pipeline z agentami AI — case study: Metoda Sufy. Zaplecze techniczne: automatyzacje (n8n, Python, API), aplikacje webowe. 17 lat jako zawodowy aktor — m.in. główna rola w serialu „Gliniarze” (Polsat) — swoboda przed obiektywem i mikrofonem. Otwarty na etat lub B2B — posiadam działalność gospodarczą. Zdalnie · PL/EU.</w:t>
             </w:r>
           </w:p>
           <w:p>
@@ -540,7 +566,7 @@
                 <w:sz w:val="22"/>
                 <w:szCs w:val="22"/>
               </w:rPr>
-              <w:t xml:space="preserve">Współtwórca · Asistel</w:t>
+              <w:t xml:space="preserve">Twórca contentu &amp; założyciel · Studio AI — Metoda Sufy</w:t>
             </w:r>
             <w:r>
               <w:rPr>
@@ -548,7 +574,7 @@
                 <w:sz w:val="18"/>
                 <w:szCs w:val="18"/>
               </w:rPr>
-              <w:t xml:space="preserve">	2026 – obecnie</w:t>
+              <w:t xml:space="preserve">	2025 – obecnie</w:t>
             </w:r>
           </w:p>
           <w:p>
@@ -563,43 +589,43 @@
                 <w:sz w:val="18"/>
                 <w:szCs w:val="18"/>
               </w:rPr>
-              <w:t xml:space="preserve">Platforma AI dla aptek i firm wielooddziałowych (asistel.pl) — współpraca w 3-osobowym, doświadczonym zespole</w:t>
-            </w:r>
-          </w:p>
-          <w:p>
-            <w:pPr>
-              <w:spacing w:after="60"/>
-            </w:pPr>
-            <w:r>
-              <w:rPr>
-                <w:sz w:val="20"/>
-                <w:szCs w:val="20"/>
-              </w:rPr>
-              <w:t xml:space="preserve">• Produkt, warstwa AI (dialog, tickety) i komunikacja z klientem; panel zarządzania zespołem i procesami w firmie</w:t>
-            </w:r>
-          </w:p>
-          <w:p>
-            <w:pPr>
-              <w:spacing w:after="60"/>
-            </w:pPr>
-            <w:r>
-              <w:rPr>
-                <w:sz w:val="20"/>
-                <w:szCs w:val="20"/>
-              </w:rPr>
-              <w:t xml:space="preserve">• PWA Asistel: notatki głosowe speech-to-text — farmaceuta nagrywa jednym dotknięciem, system zapisuje tekst; praca bez odrywania rąk</w:t>
-            </w:r>
-          </w:p>
-          <w:p>
-            <w:pPr>
-              <w:spacing w:after="60"/>
-            </w:pPr>
-            <w:r>
-              <w:rPr>
-                <w:sz w:val="20"/>
-                <w:szCs w:val="20"/>
-              </w:rPr>
-              <w:t xml:space="preserve">• Głosowy agent odbierający połączenia — code-review i wspólne zatwierdzanie w zespole</w:t>
+              <w:t xml:space="preserve">Marka osobista prowadzona jak studio contentu: YouTube, Instagram, Facebook — pełny cykl od pomysłu po publikację</w:t>
+            </w:r>
+          </w:p>
+          <w:p>
+            <w:pPr>
+              <w:spacing w:after="60"/>
+            </w:pPr>
+            <w:r>
+              <w:rPr>
+                <w:sz w:val="20"/>
+                <w:szCs w:val="20"/>
+              </w:rPr>
+              <w:t xml:space="preserve">• Produkcja wideo end-to-end: scenariusz → lektor/nagranie → montaż (CapCut Pro, ffmpeg, DaVinci Resolve) → miniatury i klatki-hook (GPT-Image, Canva) → publikacja</w:t>
+            </w:r>
+          </w:p>
+          <w:p>
+            <w:pPr>
+              <w:spacing w:after="60"/>
+            </w:pPr>
+            <w:r>
+              <w:rPr>
+                <w:sz w:val="20"/>
+                <w:szCs w:val="20"/>
+              </w:rPr>
+              <w:t xml:space="preserve">• Autorski zautomatyzowany pipeline z agentami AI: radar trendów, analityka rezonansu postów, kalendarz treści, kolejka publikacji (n8n, VPS)</w:t>
+            </w:r>
+          </w:p>
+          <w:p>
+            <w:pPr>
+              <w:spacing w:after="60"/>
+            </w:pPr>
+            <w:r>
+              <w:rPr>
+                <w:sz w:val="20"/>
+                <w:szCs w:val="20"/>
+              </w:rPr>
+              <w:t xml:space="preserve">• Redakcja i copywriting PL: posty, karuzele, haki, sekwencje e-mail; sprzedaż własnego ebooka</w:t>
             </w:r>
           </w:p>
           <w:p>
@@ -613,7 +639,7 @@
                 <w:sz w:val="22"/>
                 <w:szCs w:val="22"/>
               </w:rPr>
-              <w:t xml:space="preserve">Założyciel &amp; AI Solutions Builder · LEV</w:t>
+              <w:t xml:space="preserve">Współtwórca · Asistel</w:t>
             </w:r>
             <w:r>
               <w:rPr>
@@ -621,7 +647,7 @@
                 <w:sz w:val="18"/>
                 <w:szCs w:val="18"/>
               </w:rPr>
-              <w:t xml:space="preserve">	2025 – obecnie</w:t>
+              <w:t xml:space="preserve">	2026 – obecnie</w:t>
             </w:r>
           </w:p>
           <w:p>
@@ -636,6 +662,79 @@
                 <w:sz w:val="18"/>
                 <w:szCs w:val="18"/>
               </w:rPr>
+              <w:t xml:space="preserve">Platforma AI dla aptek i firm wielooddziałowych (asistel.pl) — współpraca w 3-osobowym, doświadczonym zespole</w:t>
+            </w:r>
+          </w:p>
+          <w:p>
+            <w:pPr>
+              <w:spacing w:after="60"/>
+            </w:pPr>
+            <w:r>
+              <w:rPr>
+                <w:sz w:val="20"/>
+                <w:szCs w:val="20"/>
+              </w:rPr>
+              <w:t xml:space="preserve">• Produkt, warstwa AI (dialog, tickety) i komunikacja z klientem; panel zarządzania zespołem i procesami w firmie</w:t>
+            </w:r>
+          </w:p>
+          <w:p>
+            <w:pPr>
+              <w:spacing w:after="60"/>
+            </w:pPr>
+            <w:r>
+              <w:rPr>
+                <w:sz w:val="20"/>
+                <w:szCs w:val="20"/>
+              </w:rPr>
+              <w:t xml:space="preserve">• PWA Asistel: notatki głosowe speech-to-text — farmaceuta nagrywa jednym dotknięciem, system zapisuje tekst; praca bez odrywania rąk</w:t>
+            </w:r>
+          </w:p>
+          <w:p>
+            <w:pPr>
+              <w:spacing w:after="60"/>
+            </w:pPr>
+            <w:r>
+              <w:rPr>
+                <w:sz w:val="20"/>
+                <w:szCs w:val="20"/>
+              </w:rPr>
+              <w:t xml:space="preserve">• Głosowy agent odbierający połączenia — code-review i wspólne zatwierdzanie w zespole</w:t>
+            </w:r>
+          </w:p>
+          <w:p>
+            <w:pPr>
+              <w:spacing w:after="40" w:before="120"/>
+            </w:pPr>
+            <w:r>
+              <w:rPr>
+                <w:b/>
+                <w:bCs/>
+                <w:sz w:val="22"/>
+                <w:szCs w:val="22"/>
+              </w:rPr>
+              <w:t xml:space="preserve">Założyciel &amp; AI Solutions Builder · LEV</w:t>
+            </w:r>
+            <w:r>
+              <w:rPr>
+                <w:color w:val="6B6558"/>
+                <w:sz w:val="18"/>
+                <w:szCs w:val="18"/>
+              </w:rPr>
+              <w:t xml:space="preserve">	2025 – obecnie</w:t>
+            </w:r>
+          </w:p>
+          <w:p>
+            <w:pPr>
+              <w:spacing w:after="80"/>
+            </w:pPr>
+            <w:r>
+              <w:rPr>
+                <w:i/>
+                <w:iCs/>
+                <w:color w:val="6B6558"/>
+                <w:sz w:val="18"/>
+                <w:szCs w:val="18"/>
+              </w:rPr>
               <w:t xml:space="preserve">Własna praktyka — rozwiązania AI dla firm</w:t>
             </w:r>
           </w:p>
@@ -689,6 +788,27 @@
                 <w:szCs w:val="22"/>
               </w:rPr>
               <w:t xml:space="preserve">Wybrane projekty</w:t>
+            </w:r>
+          </w:p>
+          <w:p>
+            <w:pPr>
+              <w:spacing w:after="60"/>
+            </w:pPr>
+            <w:r>
+              <w:rPr>
+                <w:b/>
+                <w:bCs/>
+                <w:sz w:val="20"/>
+                <w:szCs w:val="20"/>
+              </w:rPr>
+              <w:t xml:space="preserve">Metoda Sufy — żywe portfolio</w:t>
+            </w:r>
+            <w:r>
+              <w:rPr>
+                <w:sz w:val="19"/>
+                <w:szCs w:val="19"/>
+              </w:rPr>
+              <w:t xml:space="preserve"> — Kanały YT/IG/FB prowadzone własnym zautomatyzowanym studiem contentu: wideo long i Reels, karuzele, ebook — pełne metryki zasięgu i zaangażowania dostępne na życzenie</w:t>
             </w:r>
           </w:p>
           <w:p>

</xml_diff>

<commit_message>
Nowa odsłona w układzie Syntax CV + Tercet Labs
- Układ jednokolumnowy z numerowanymi sekcjami, czerń + mięta, font Switzer
- Doświadczenie: Tercet Labs (współzałożyciel, jedna linia + link), LEV, Studio AI, aktorstwo
- Linki do Instagrama i Facebooka @maciejvsufa oraz tercetlabs.pl, asistel.pl, metodasufy.pl
- JSON-LD: Person (sameAs tylko profile osobiste) + Organization Tercet Labs z founder
- Usunięty stary opis „automatyzacja procesów z AI” z meta, manifestu, llms.txt i OG
- CV (PL/EN): Tercet Labs z Asistelem, nowe zdanie o LEV; nowy obrazek OG i ikony

Co-Authored-By: Claude Opus 5.5 <noreply@anthropic.com>
</commit_message>
<xml_diff>
--- a/public/cv/Maciej_Sufa_CV.docx
+++ b/public/cv/Maciej_Sufa_CV.docx
@@ -536,7 +536,7 @@
                 <w:sz w:val="20"/>
                 <w:szCs w:val="20"/>
               </w:rPr>
-              <w:t xml:space="preserve">Tworzę content na social media od pomysłu po publikację: scenariusze i redakcja tekstów, wideo (CapCut Pro, DaVinci Resolve, ffmpeg), grafiki i miniatury (Canva, GPT-Image), kalendarz treści sprzężony z trendami i analityką. Prowadzę własne kanały (YT/IG/FB) na autorskim, zautomatyzowanym pipeline z agentami AI — case study: Metoda Sufy. Zaplecze techniczne: automatyzacje (n8n, Python, API), aplikacje webowe. 17 lat jako zawodowy aktor — m.in. główna rola w serialu „Gliniarze” (Polsat) — swoboda przed obiektywem i mikrofonem. Otwarty na etat lub B2B — posiadam działalność gospodarczą. Zdalnie · PL/EU.</w:t>
+              <w:t xml:space="preserve">Tworzę content na social media od pomysłu po publikację: scenariusze i redakcja tekstów, wideo (CapCut Pro, DaVinci Resolve, ffmpeg), grafiki i miniatury (Canva, GPT-Image), kalendarz treści sprzężony z trendami i analityką. Prowadzę własne kanały (YT/IG/FB) na autorskim, zautomatyzowanym pipeline z agentami AI — case study: Metoda Sufy. Zaplecze techniczne: automatyzacje (n8n, Python, API), aplikacje webowe. 17 lat jako zawodowy aktor — m.in. główna rola w serialu „Gliniarze” (Polsat) — swoboda przed obiektywem i mikrofonem. Współzałożyciel Tercet Labs. Otwarty na etat lub B2B — posiadam działalność gospodarczą. Zdalnie · PL/EU.</w:t>
             </w:r>
           </w:p>
           <w:p>
@@ -566,7 +566,7 @@
                 <w:sz w:val="22"/>
                 <w:szCs w:val="22"/>
               </w:rPr>
-              <w:t xml:space="preserve">Twórca contentu &amp; założyciel · Studio AI — Metoda Sufy</w:t>
+              <w:t xml:space="preserve">Współzałożyciel · Tercet Labs sp. z o.o.</w:t>
             </w:r>
             <w:r>
               <w:rPr>
@@ -574,7 +574,7 @@
                 <w:sz w:val="18"/>
                 <w:szCs w:val="18"/>
               </w:rPr>
-              <w:t xml:space="preserve">	2025 – obecnie</w:t>
+              <w:t xml:space="preserve">	2026 – obecnie</w:t>
             </w:r>
           </w:p>
           <w:p>
@@ -589,7 +589,7 @@
                 <w:sz w:val="18"/>
                 <w:szCs w:val="18"/>
               </w:rPr>
-              <w:t xml:space="preserve">Marka osobista prowadzona jak studio contentu: YouTube, Instagram, Facebook — pełny cykl od pomysłu po publikację</w:t>
+              <w:t xml:space="preserve">Spółka, która wdraża AI w firmach razem z ich zespołami (tercetlabs.pl). Jeden z naszych produktów to Asistel — asystent głosowy dla aptek (asistel.pl)</w:t>
             </w:r>
           </w:p>
           <w:p>
@@ -601,7 +601,7 @@
                 <w:sz w:val="20"/>
                 <w:szCs w:val="20"/>
               </w:rPr>
-              <w:t xml:space="preserve">• Produkcja wideo end-to-end: scenariusz → lektor/nagranie → montaż (CapCut Pro, ffmpeg, DaVinci Resolve) → miniatury i klatki-hook (GPT-Image, Canva) → publikacja</w:t>
+              <w:t xml:space="preserve">• Produkt, warstwa AI (dialog, tickety) i komunikacja z klientem; panel zarządzania zespołem i procesami w firmie</w:t>
             </w:r>
           </w:p>
           <w:p>
@@ -613,7 +613,7 @@
                 <w:sz w:val="20"/>
                 <w:szCs w:val="20"/>
               </w:rPr>
-              <w:t xml:space="preserve">• Autorski zautomatyzowany pipeline z agentami AI: radar trendów, analityka rezonansu postów, kalendarz treści, kolejka publikacji (n8n, VPS)</w:t>
+              <w:t xml:space="preserve">• PWA Asistel: notatki głosowe speech-to-text — farmaceuta nagrywa jednym dotknięciem, system zapisuje tekst; praca bez odrywania rąk</w:t>
             </w:r>
           </w:p>
           <w:p>
@@ -625,7 +625,7 @@
                 <w:sz w:val="20"/>
                 <w:szCs w:val="20"/>
               </w:rPr>
-              <w:t xml:space="preserve">• Redakcja i copywriting PL: posty, karuzele, haki, sekwencje e-mail; sprzedaż własnego ebooka</w:t>
+              <w:t xml:space="preserve">• Głosowy agent odbierający połączenia — code-review i wspólne zatwierdzanie w zespole</w:t>
             </w:r>
           </w:p>
           <w:p>
@@ -639,7 +639,7 @@
                 <w:sz w:val="22"/>
                 <w:szCs w:val="22"/>
               </w:rPr>
-              <w:t xml:space="preserve">Współtwórca · Asistel</w:t>
+              <w:t xml:space="preserve">Twórca contentu &amp; założyciel · Studio AI — Metoda Sufy</w:t>
             </w:r>
             <w:r>
               <w:rPr>
@@ -647,7 +647,7 @@
                 <w:sz w:val="18"/>
                 <w:szCs w:val="18"/>
               </w:rPr>
-              <w:t xml:space="preserve">	2026 – obecnie</w:t>
+              <w:t xml:space="preserve">	2025 – obecnie</w:t>
             </w:r>
           </w:p>
           <w:p>
@@ -662,7 +662,7 @@
                 <w:sz w:val="18"/>
                 <w:szCs w:val="18"/>
               </w:rPr>
-              <w:t xml:space="preserve">Platforma AI dla aptek i firm wielooddziałowych (asistel.pl) — współpraca w 3-osobowym, doświadczonym zespole</w:t>
+              <w:t xml:space="preserve">Marka osobista prowadzona jak studio contentu: YouTube, Instagram, Facebook — pełny cykl od pomysłu po publikację</w:t>
             </w:r>
           </w:p>
           <w:p>
@@ -674,7 +674,7 @@
                 <w:sz w:val="20"/>
                 <w:szCs w:val="20"/>
               </w:rPr>
-              <w:t xml:space="preserve">• Produkt, warstwa AI (dialog, tickety) i komunikacja z klientem; panel zarządzania zespołem i procesami w firmie</w:t>
+              <w:t xml:space="preserve">• Produkcja wideo end-to-end: scenariusz → lektor/nagranie → montaż (CapCut Pro, ffmpeg, DaVinci Resolve) → miniatury i klatki-hook (GPT-Image, Canva) → publikacja</w:t>
             </w:r>
           </w:p>
           <w:p>
@@ -686,7 +686,7 @@
                 <w:sz w:val="20"/>
                 <w:szCs w:val="20"/>
               </w:rPr>
-              <w:t xml:space="preserve">• PWA Asistel: notatki głosowe speech-to-text — farmaceuta nagrywa jednym dotknięciem, system zapisuje tekst; praca bez odrywania rąk</w:t>
+              <w:t xml:space="preserve">• Autorski zautomatyzowany pipeline z agentami AI: radar trendów, analityka rezonansu postów, kalendarz treści, kolejka publikacji (n8n, VPS)</w:t>
             </w:r>
           </w:p>
           <w:p>
@@ -698,7 +698,7 @@
                 <w:sz w:val="20"/>
                 <w:szCs w:val="20"/>
               </w:rPr>
-              <w:t xml:space="preserve">• Głosowy agent odbierający połączenia — code-review i wspólne zatwierdzanie w zespole</w:t>
+              <w:t xml:space="preserve">• Redakcja i copywriting PL: posty, karuzele, haki, sekwencje e-mail; sprzedaż własnego ebooka</w:t>
             </w:r>
           </w:p>
           <w:p>
@@ -712,7 +712,7 @@
                 <w:sz w:val="22"/>
                 <w:szCs w:val="22"/>
               </w:rPr>
-              <w:t xml:space="preserve">Założyciel &amp; AI Solutions Builder · LEV</w:t>
+              <w:t xml:space="preserve">Założyciel · LEV</w:t>
             </w:r>
             <w:r>
               <w:rPr>
@@ -735,7 +735,7 @@
                 <w:sz w:val="18"/>
                 <w:szCs w:val="18"/>
               </w:rPr>
-              <w:t xml:space="preserve">Własna praktyka — rozwiązania AI dla firm</w:t>
+              <w:t xml:space="preserve">Moja praktyka: content i social media dla firm</w:t>
             </w:r>
           </w:p>
           <w:p>
@@ -747,7 +747,7 @@
                 <w:sz w:val="20"/>
                 <w:szCs w:val="20"/>
               </w:rPr>
-              <w:t xml:space="preserve">• Audyt → prototyp → wdrożenie: automatyzacje, aplikacje, strony, integracje API</w:t>
+              <w:t xml:space="preserve">• Content dla firm od pomysłu po publikację: scenariusze, wideo, grafiki i miniatury, kalendarz treści</w:t>
             </w:r>
           </w:p>
           <w:p>
@@ -759,19 +759,7 @@
                 <w:sz w:val="20"/>
                 <w:szCs w:val="20"/>
               </w:rPr>
-              <w:t xml:space="preserve">• ExoVault (exovault.co) jako narzędzie pracy: szyfrowana pamięć agenta AI, organizacja zadań i komunikacja zespołu</w:t>
-            </w:r>
-          </w:p>
-          <w:p>
-            <w:pPr>
-              <w:spacing w:after="60"/>
-            </w:pPr>
-            <w:r>
-              <w:rPr>
-                <w:sz w:val="20"/>
-                <w:szCs w:val="20"/>
-              </w:rPr>
-              <w:t xml:space="preserve">• Automatyzacja social media, szkolenia zespołów</w:t>
+              <w:t xml:space="preserve">• Automatyzacja social media i szkolenia zespołów z narzędzi AI</w:t>
             </w:r>
           </w:p>
           <w:p>
@@ -809,27 +797,6 @@
                 <w:szCs w:val="19"/>
               </w:rPr>
               <w:t xml:space="preserve"> — Kanały YT/IG/FB prowadzone własnym zautomatyzowanym studiem contentu: wideo long i Reels, karuzele, ebook — pełne metryki zasięgu i zaangażowania dostępne na życzenie</w:t>
-            </w:r>
-          </w:p>
-          <w:p>
-            <w:pPr>
-              <w:spacing w:after="60"/>
-            </w:pPr>
-            <w:r>
-              <w:rPr>
-                <w:b/>
-                <w:bCs/>
-                <w:sz w:val="20"/>
-                <w:szCs w:val="20"/>
-              </w:rPr>
-              <w:t xml:space="preserve">Asistel</w:t>
-            </w:r>
-            <w:r>
-              <w:rPr>
-                <w:sz w:val="19"/>
-                <w:szCs w:val="19"/>
-              </w:rPr>
-              <w:t xml:space="preserve"> — Platforma AI dla aptek i firm wielooddziałowych, współtworzona w 3-osobowym zespole: głosowy agent AI odbierający połączenia, PWA z notatkami speech-to-text, panel zarządzania zespołem i procesami</w:t>
             </w:r>
           </w:p>
           <w:p>

</xml_diff>

<commit_message>
Kto za tym stoi: właściciel LEV, Content Creator, aktor, współudziałowiec Tercet Labs; bez miasta
- O mnie: najpierw LEV (właściciel), Content Creator i aktor, potem udziały w Tercet Labs
- Aktorstwo w czasie teraźniejszym („17 lat przed kamerą i na scenie”)
- Usunięte miasto ze strony, JSON-LD, llms.txt i stopki polityki prywatności;
  zostaje „pracuję zdalnie z firmami z Polski i UE”
- CV (PDF/DOCX/HTML): zamiast adresu z ulicą „Praca zdalna (PL / UE)”,
  te same role co na stronie; stopka CV bierze adres z content.json

Co-Authored-By: Claude Opus 5.5 <noreply@anthropic.com>
</commit_message>
<xml_diff>
--- a/public/cv/Maciej_Sufa_CV.docx
+++ b/public/cv/Maciej_Sufa_CV.docx
@@ -174,7 +174,7 @@
                 <w:sz w:val="18"/>
                 <w:szCs w:val="18"/>
               </w:rPr>
-              <w:t xml:space="preserve">Łódź, ul. Milionowa 243</w:t>
+              <w:t xml:space="preserve">Praca zdalna (PL / UE)</w:t>
             </w:r>
           </w:p>
           <w:p>
@@ -536,7 +536,7 @@
                 <w:sz w:val="20"/>
                 <w:szCs w:val="20"/>
               </w:rPr>
-              <w:t xml:space="preserve">Tworzę content na social media od pomysłu po publikację: scenariusze i redakcja tekstów, wideo (CapCut Pro, DaVinci Resolve, ffmpeg), grafiki i miniatury (Canva, GPT-Image), kalendarz treści sprzężony z trendami i analityką. Prowadzę własne kanały (YT/IG/FB) na autorskim, zautomatyzowanym pipeline z agentami AI — case study: Metoda Sufy. Zaplecze techniczne: automatyzacje (n8n, Python, API), aplikacje webowe. 17 lat jako zawodowy aktor — m.in. główna rola w serialu „Gliniarze” (Polsat) — swoboda przed obiektywem i mikrofonem. Współzałożyciel Tercet Labs. Otwarty na etat lub B2B — posiadam działalność gospodarczą. Zdalnie · PL/EU.</w:t>
+              <w:t xml:space="preserve">Tworzę content na social media od pomysłu po publikację: scenariusze i redakcja tekstów, wideo (CapCut Pro, DaVinci Resolve, ffmpeg), grafiki i miniatury (Canva, GPT-Image), kalendarz treści sprzężony z trendami i analityką. Prowadzę własne kanały (YT/IG/FB) na autorskim, zautomatyzowanym pipeline z agentami AI — case study: Metoda Sufy. Zaplecze techniczne: automatyzacje (n8n, Python, API), aplikacje webowe. 17 lat jako zawodowy aktor — m.in. główna rola w serialu „Gliniarze” (Polsat) — swoboda przed obiektywem i mikrofonem. Właściciel firmy LEV, współudziałowiec Tercet Labs. Otwarty na etat lub B2B — posiadam działalność gospodarczą. Zdalnie · PL/EU.</w:t>
             </w:r>
           </w:p>
           <w:p>
@@ -566,7 +566,7 @@
                 <w:sz w:val="22"/>
                 <w:szCs w:val="22"/>
               </w:rPr>
-              <w:t xml:space="preserve">Współzałożyciel · Tercet Labs sp. z o.o.</w:t>
+              <w:t xml:space="preserve">Współudziałowiec · Tercet Labs sp. z o.o.</w:t>
             </w:r>
             <w:r>
               <w:rPr>

</xml_diff>